<commit_message>
Update master resume and portfolio details
</commit_message>
<xml_diff>
--- a/GE_Master_Resume.docx
+++ b/GE_Master_Resume.docx
@@ -26,7 +26,7 @@
         <w:jc w:val="center"/>
       </w:pPr>
       <w:r>
-        <w:t>PMP  •  CPM  •  AutoCAD Civil 3D Certified Professional  •  OSHA</w:t>
+        <w:t>AutoCAD Civil 3D Certified Professional  •  OSHA Safety Trained  •  English / Spanish / Portuguese</w:t>
       </w:r>
     </w:p>
     <w:p>
@@ -60,7 +60,7 @@
     </w:p>
     <w:p>
       <w:r>
-        <w:t>PMP- and CPM-certified construction and civil project management professional with 30+ years of experience delivering commercial, residential, industrial, hospitality, infrastructure, and land-development work across five countries. Proven background in full project lifecycle management, Owner's Representation, technical-office leadership, project controls, permitting, budgeting, scheduling, construction documentation, QA/QC, and turnover. Combines senior-level project and operations leadership with hands-on AutoCAD Civil 3D expertise, enabling effective coordination among owners, architects, engineers, contractors, agencies, vendors, and field teams.</w:t>
+        <w:t>Construction and civil project management professional with 30+ years of experience across commercial, residential, industrial, hospitality, infrastructure, and land development in five countries. Leads scope, schedules, budgets, permitting, technical teams, and construction documentation from planning through turnover. Combines owner representation and project controls with hands-on AutoCAD Civil 3D expertise. Selected roles below cover 2004–present.</w:t>
       </w:r>
     </w:p>
     <w:p>
@@ -152,7 +152,7 @@
         </w:pBdr>
       </w:pPr>
       <w:r>
-        <w:t>PROFESSIONAL EXPERIENCE</w:t>
+        <w:t>SELECTED PROFESSIONAL EXPERIENCE</w:t>
       </w:r>
     </w:p>
     <w:p>
@@ -162,9 +162,9 @@
       <w:r>
         <w:rPr>
           <w:b/>
-          <w:sz w:val="19"/>
+          <w:sz w:val="20"/>
         </w:rPr>
-        <w:t>Remote CAD / Blueprint Designer &amp; PM Consultant (Concurrent)</w:t>
+        <w:t>Independent Project Management &amp; Civil Design Consultant (Concurrent)</w:t>
       </w:r>
       <w:r>
         <w:rPr>
@@ -197,7 +197,7 @@
         <w:t xml:space="preserve">• </w:t>
       </w:r>
       <w:r>
-        <w:t>Deliver construction drawings and civil plan sets for construction, engineering, and land-development clients using AutoCAD and Civil 3D, including site, grading, drainage, stormwater, and utility documentation.</w:t>
+        <w:t>Advise construction and land-development clients on project scope, schedules, budgets, permitting strategy, design coordination, and owner representation across concurrent engagements.</w:t>
       </w:r>
     </w:p>
     <w:p>
@@ -212,7 +212,7 @@
         <w:t xml:space="preserve">• </w:t>
       </w:r>
       <w:r>
-        <w:t>Produce permitting-ready plan sets, incorporate red-lines, maintain CAD standards, and perform QA/QC for code-compliant documentation.</w:t>
+        <w:t>Develop construction drawings and Civil 3D plan sets covering site layout, grading, drainage, stormwater, and utilities; incorporate client red-lines.</w:t>
       </w:r>
     </w:p>
     <w:p>
@@ -227,7 +227,7 @@
         <w:t xml:space="preserve">• </w:t>
       </w:r>
       <w:r>
-        <w:t>Provide project-management and Owner's-Representative consulting covering scope, schedule, budget, permitting strategy, design coordination, and construction execution across concurrent engagements.</w:t>
+        <w:t>Maintain CAD standards and perform QA/QC on permitting-ready documentation for construction and engineering clients.</w:t>
       </w:r>
     </w:p>
     <w:p>
@@ -237,7 +237,7 @@
       <w:r>
         <w:rPr>
           <w:b/>
-          <w:sz w:val="19"/>
+          <w:sz w:val="20"/>
         </w:rPr>
         <w:t>Multi-Site Operations Coordinator (Concurrent)</w:t>
       </w:r>
@@ -272,7 +272,7 @@
         <w:t xml:space="preserve">• </w:t>
       </w:r>
       <w:r>
-        <w:t>Coordinate operations, facility needs, equipment logistics, vendors, and site stakeholders across 20+ distributed locations while minimizing disruption to occupied operations.</w:t>
+        <w:t>Coordinate facility needs, equipment logistics, vendors, and site stakeholders across 20+ locations, supporting continuity in occupied operations.</w:t>
       </w:r>
     </w:p>
     <w:p>
@@ -287,7 +287,7 @@
         <w:t xml:space="preserve">• </w:t>
       </w:r>
       <w:r>
-        <w:t>Support regulatory-compliance programs and process improvements, serving as a central coordination point between site staff, vendors, and leadership.</w:t>
+        <w:t>Serve as the coordination point between site staff, vendors, and leadership for regulatory-compliance programs and process improvements.</w:t>
       </w:r>
     </w:p>
     <w:p>
@@ -297,7 +297,7 @@
       <w:r>
         <w:rPr>
           <w:b/>
-          <w:sz w:val="19"/>
+          <w:sz w:val="20"/>
         </w:rPr>
         <w:t>Operations Manager</w:t>
       </w:r>
@@ -332,7 +332,7 @@
         <w:t xml:space="preserve">• </w:t>
       </w:r>
       <w:r>
-        <w:t>Directed daily operations, procurement, vendor management, and logistics across concurrent workstreams, with responsibility for budget and schedule coordination.</w:t>
+        <w:t>Managed procurement, vendor relationships, logistics, budgets, and schedules across concurrent operational workstreams.</w:t>
       </w:r>
     </w:p>
     <w:p>
@@ -347,17 +347,18 @@
         <w:t xml:space="preserve">• </w:t>
       </w:r>
       <w:r>
-        <w:t>Coordinated internal and external stakeholders to maintain workflow continuity, resolve operational issues, and support timely execution.</w:t>
+        <w:t>Resolved operational issues with internal teams and external partners to support timely execution and workflow continuity.</w:t>
       </w:r>
     </w:p>
     <w:p>
       <w:pPr>
+        <w:pageBreakBefore/>
         <w:spacing w:before="60" w:after="0"/>
       </w:pPr>
       <w:r>
         <w:rPr>
           <w:b/>
-          <w:sz w:val="19"/>
+          <w:sz w:val="20"/>
         </w:rPr>
         <w:t>Senior Project Manager / Senior Civil Designer</w:t>
       </w:r>
@@ -392,7 +393,7 @@
         <w:t xml:space="preserve">• </w:t>
       </w:r>
       <w:r>
-        <w:t>Managed commercial, residential, and mixed-use design and construction assignments through budgeting, scheduling, permitting, coordination, and construction-document development.</w:t>
+        <w:t>Managed budgets, schedules, permitting, and construction documentation for commercial, residential, and mixed-use assignments.</w:t>
       </w:r>
     </w:p>
     <w:p>
@@ -407,7 +408,7 @@
         <w:t xml:space="preserve">• </w:t>
       </w:r>
       <w:r>
-        <w:t>Led production and coordination of Civil 3D packages covering site plans, grading, drainage, stormwater, and utilities.</w:t>
+        <w:t>Led Civil 3D plan production for site layouts, grading, drainage, stormwater, and utilities; coordinated agency review comments.</w:t>
       </w:r>
     </w:p>
     <w:p>
@@ -422,7 +423,7 @@
         <w:t xml:space="preserve">• </w:t>
       </w:r>
       <w:r>
-        <w:t>Coordinated architects, engineers, contractors, and permitting authorities; incorporated agency review comments and maintained disciplined document control.</w:t>
+        <w:t>Coordinated architects, engineers, contractors, and permitting authorities while maintaining disciplined project document control.</w:t>
       </w:r>
     </w:p>
     <w:p>
@@ -432,7 +433,7 @@
       <w:r>
         <w:rPr>
           <w:b/>
-          <w:sz w:val="19"/>
+          <w:sz w:val="20"/>
         </w:rPr>
         <w:t>Senior Civil Designer &amp; Project Lead</w:t>
       </w:r>
@@ -492,7 +493,7 @@
       <w:r>
         <w:rPr>
           <w:b/>
-          <w:sz w:val="19"/>
+          <w:sz w:val="20"/>
         </w:rPr>
         <w:t>Technical Office Manager — Civil Area Leader</w:t>
       </w:r>
@@ -527,7 +528,7 @@
         <w:t xml:space="preserve">• </w:t>
       </w:r>
       <w:r>
-        <w:t>Led technical-office operations and a 12-person multidisciplinary CAD/engineering team, coordinating drawing production, technical deliverables, and concurrent site requirements.</w:t>
+        <w:t>Led technical-office operations and a 12-person multidisciplinary CAD and engineering team across drawing production and concurrent site requirements.</w:t>
       </w:r>
     </w:p>
     <w:p>
@@ -542,7 +543,7 @@
         <w:t xml:space="preserve">• </w:t>
       </w:r>
       <w:r>
-        <w:t>Managed CAD standards, QA/QC, regulatory submittals, document control, and multidisciplinary coordination while mentoring junior designers.</w:t>
+        <w:t>Managed CAD standards, QA/QC, regulatory submittals, and document control while mentoring junior designers.</w:t>
       </w:r>
     </w:p>
     <w:p>
@@ -552,7 +553,7 @@
       <w:r>
         <w:rPr>
           <w:b/>
-          <w:sz w:val="19"/>
+          <w:sz w:val="20"/>
         </w:rPr>
         <w:t>Design Manager &amp; Project Lead</w:t>
       </w:r>
@@ -618,7 +619,7 @@
     </w:p>
     <w:p>
       <w:r>
-        <w:t>Project Management Professional (PMP) — PMI  •  Construction Project Manager (CPM) — AAPM  •  AutoCAD Civil 3D Certified Professional — Autodesk  •  Construction Design Management (CDM)  •  OSHA Safety Trained</w:t>
+        <w:t>Project Management Professional (PMP), PMI — renewal in progress  •  Construction Project Manager (CPM), AAPM — renewal in progress  •  AutoCAD Civil 3D Certified Professional, Autodesk  •  Construction Design Management (CDM)  •  OSHA Safety Trained</w:t>
       </w:r>
     </w:p>
     <w:p>
@@ -645,7 +646,7 @@
         <w:spacing w:after="20"/>
       </w:pPr>
       <w:r>
-        <w:t>A.S., Mechanical Design — Unisinus, Brazil | 2000–2002</w:t>
+        <w:t>A.S., Mechanical Design — UNISINOS, Brazil | 2000–2002</w:t>
       </w:r>
     </w:p>
     <w:p>
@@ -1065,11 +1066,11 @@
     <w:qFormat/>
     <w:rsid w:val="00FC693F"/>
     <w:pPr>
-      <w:spacing w:after="36" w:line="240" w:lineRule="auto"/>
+      <w:spacing w:after="36" w:line="254" w:lineRule="auto"/>
     </w:pPr>
     <w:rPr>
       <w:rFonts w:ascii="Arial" w:hAnsi="Arial"/>
-      <w:sz w:val="18"/>
+      <w:sz w:val="20"/>
     </w:rPr>
   </w:style>
   <w:style w:type="paragraph" w:styleId="Header">

</xml_diff>